<commit_message>
DONE but revisi paper
</commit_message>
<xml_diff>
--- a/AFTER SIDANG/LAMPIRAN.docx
+++ b/AFTER SIDANG/LAMPIRAN.docx
@@ -113,11 +113,6 @@
     <w:p>
       <w:pPr>
         <w:spacing w:line="360" w:lineRule="auto"/>
-        <w:rPr>
-          <w:sz w:val="24"/>
-          <w:szCs w:val="24"/>
-          <w:lang w:val="en-GB"/>
-        </w:rPr>
       </w:pPr>
       <w:hyperlink r:id="rId5" w:history="1">
         <w:r>
@@ -140,43 +135,72 @@
           <w:lang w:val="en-GB"/>
         </w:rPr>
       </w:pPr>
+      <w:hyperlink r:id="rId6" w:history="1">
+        <w:r>
+          <w:rPr>
+            <w:rStyle w:val="Hyperlink"/>
+            <w:sz w:val="24"/>
+            <w:szCs w:val="24"/>
+            <w:lang w:val="en-GB"/>
+          </w:rPr>
+          <w:t>https://xginterface.streamlit.app/</w:t>
+        </w:r>
+      </w:hyperlink>
       <w:r>
         <w:rPr>
           <w:sz w:val="24"/>
           <w:szCs w:val="24"/>
           <w:lang w:val="en-GB"/>
         </w:rPr>
-        <w:t xml:space="preserve">Google </w:t>
-      </w:r>
-      <w:proofErr w:type="spellStart"/>
-      <w:r>
+        <w:t xml:space="preserve"> </w:t>
+      </w:r>
+    </w:p>
+    <w:p>
+      <w:pPr>
+        <w:spacing w:line="360" w:lineRule="auto"/>
         <w:rPr>
           <w:sz w:val="24"/>
           <w:szCs w:val="24"/>
           <w:lang w:val="en-GB"/>
         </w:rPr>
-        <w:t>Colab</w:t>
-      </w:r>
-      <w:proofErr w:type="spellEnd"/>
+      </w:pPr>
       <w:r>
         <w:rPr>
           <w:sz w:val="24"/>
           <w:szCs w:val="24"/>
           <w:lang w:val="en-GB"/>
         </w:rPr>
-        <w:t>:</w:t>
-      </w:r>
-    </w:p>
-    <w:p>
-      <w:pPr>
-        <w:spacing w:line="360" w:lineRule="auto"/>
+        <w:t xml:space="preserve">Google </w:t>
+      </w:r>
+      <w:proofErr w:type="spellStart"/>
+      <w:r>
         <w:rPr>
           <w:sz w:val="24"/>
           <w:szCs w:val="24"/>
           <w:lang w:val="en-GB"/>
         </w:rPr>
-      </w:pPr>
-      <w:hyperlink r:id="rId6" w:history="1">
+        <w:t>Colab</w:t>
+      </w:r>
+      <w:proofErr w:type="spellEnd"/>
+      <w:r>
+        <w:rPr>
+          <w:sz w:val="24"/>
+          <w:szCs w:val="24"/>
+          <w:lang w:val="en-GB"/>
+        </w:rPr>
+        <w:t>:</w:t>
+      </w:r>
+    </w:p>
+    <w:p>
+      <w:pPr>
+        <w:spacing w:line="360" w:lineRule="auto"/>
+        <w:rPr>
+          <w:sz w:val="24"/>
+          <w:szCs w:val="24"/>
+          <w:lang w:val="en-GB"/>
+        </w:rPr>
+      </w:pPr>
+      <w:hyperlink r:id="rId7" w:history="1">
         <w:r>
           <w:rPr>
             <w:rStyle w:val="Hyperlink"/>
@@ -2069,33 +2093,7 @@
           <w:lang w:eastAsia="id-ID"/>
           <w14:ligatures w14:val="none"/>
         </w:rPr>
-        <w:t xml:space="preserve"> </w:t>
-      </w:r>
-      <w:proofErr w:type="spellStart"/>
-      <w:r>
-        <w:rPr>
-          <w:rFonts w:ascii="Courier New" w:eastAsia="Times New Roman" w:hAnsi="Courier New" w:cs="Courier New"/>
-          <w:color w:val="000000"/>
-          <w:kern w:val="0"/>
-          <w:sz w:val="21"/>
-          <w:szCs w:val="21"/>
-          <w:lang w:eastAsia="id-ID"/>
-          <w14:ligatures w14:val="none"/>
-        </w:rPr>
-        <w:t>Exception</w:t>
-      </w:r>
-      <w:proofErr w:type="spellEnd"/>
-      <w:r>
-        <w:rPr>
-          <w:rFonts w:ascii="Courier New" w:eastAsia="Times New Roman" w:hAnsi="Courier New" w:cs="Courier New"/>
-          <w:color w:val="000000"/>
-          <w:kern w:val="0"/>
-          <w:sz w:val="21"/>
-          <w:szCs w:val="21"/>
-          <w:lang w:eastAsia="id-ID"/>
-          <w14:ligatures w14:val="none"/>
-        </w:rPr>
-        <w:t xml:space="preserve"> </w:t>
+        <w:t xml:space="preserve"> Exception </w:t>
       </w:r>
       <w:r>
         <w:rPr>
@@ -2364,33 +2362,7 @@
           <w:lang w:eastAsia="id-ID"/>
           <w14:ligatures w14:val="none"/>
         </w:rPr>
-        <w:t xml:space="preserve"> </w:t>
-      </w:r>
-      <w:proofErr w:type="spellStart"/>
-      <w:r>
-        <w:rPr>
-          <w:rFonts w:ascii="Courier New" w:eastAsia="Times New Roman" w:hAnsi="Courier New" w:cs="Courier New"/>
-          <w:color w:val="000000"/>
-          <w:kern w:val="0"/>
-          <w:sz w:val="21"/>
-          <w:szCs w:val="21"/>
-          <w:lang w:eastAsia="id-ID"/>
-          <w14:ligatures w14:val="none"/>
-        </w:rPr>
-        <w:t>df_list</w:t>
-      </w:r>
-      <w:proofErr w:type="spellEnd"/>
-      <w:r>
-        <w:rPr>
-          <w:rFonts w:ascii="Courier New" w:eastAsia="Times New Roman" w:hAnsi="Courier New" w:cs="Courier New"/>
-          <w:color w:val="000000"/>
-          <w:kern w:val="0"/>
-          <w:sz w:val="21"/>
-          <w:szCs w:val="21"/>
-          <w:lang w:eastAsia="id-ID"/>
-          <w14:ligatures w14:val="none"/>
-        </w:rPr>
-        <w:t>:</w:t>
+        <w:t xml:space="preserve"> df_list:</w:t>
       </w:r>
     </w:p>
     <w:p>
@@ -2627,6 +2599,7 @@
           <w:lang w:eastAsia="id-ID"/>
           <w14:ligatures w14:val="none"/>
         </w:rPr>
+        <w:lastRenderedPageBreak/>
         <w:t xml:space="preserve">            </w:t>
       </w:r>
       <w:proofErr w:type="spellStart"/>
@@ -2782,7 +2755,6 @@
           <w:lang w:eastAsia="id-ID"/>
           <w14:ligatures w14:val="none"/>
         </w:rPr>
-        <w:lastRenderedPageBreak/>
         <w:t xml:space="preserve">    </w:t>
       </w:r>
       <w:proofErr w:type="spellStart"/>
@@ -6119,6 +6091,7 @@
           <w:lang w:eastAsia="id-ID"/>
           <w14:ligatures w14:val="none"/>
         </w:rPr>
+        <w:lastRenderedPageBreak/>
         <w:t xml:space="preserve">    </w:t>
       </w:r>
       <w:proofErr w:type="spellStart"/>
@@ -6372,7 +6345,6 @@
           <w:lang w:eastAsia="id-ID"/>
           <w14:ligatures w14:val="none"/>
         </w:rPr>
-        <w:lastRenderedPageBreak/>
         <w:t xml:space="preserve">    </w:t>
       </w:r>
       <w:proofErr w:type="spellStart"/>
@@ -6399,33 +6371,7 @@
           <w:lang w:eastAsia="id-ID"/>
           <w14:ligatures w14:val="none"/>
         </w:rPr>
-        <w:t xml:space="preserve"> </w:t>
-      </w:r>
-      <w:proofErr w:type="spellStart"/>
-      <w:r>
-        <w:rPr>
-          <w:rFonts w:ascii="Courier New" w:eastAsia="Times New Roman" w:hAnsi="Courier New" w:cs="Courier New"/>
-          <w:color w:val="000000"/>
-          <w:kern w:val="0"/>
-          <w:sz w:val="21"/>
-          <w:szCs w:val="21"/>
-          <w:lang w:eastAsia="id-ID"/>
-          <w14:ligatures w14:val="none"/>
-        </w:rPr>
-        <w:t>col</w:t>
-      </w:r>
-      <w:proofErr w:type="spellEnd"/>
-      <w:r>
-        <w:rPr>
-          <w:rFonts w:ascii="Courier New" w:eastAsia="Times New Roman" w:hAnsi="Courier New" w:cs="Courier New"/>
-          <w:color w:val="000000"/>
-          <w:kern w:val="0"/>
-          <w:sz w:val="21"/>
-          <w:szCs w:val="21"/>
-          <w:lang w:eastAsia="id-ID"/>
-          <w14:ligatures w14:val="none"/>
-        </w:rPr>
-        <w:t xml:space="preserve"> </w:t>
+        <w:t xml:space="preserve"> col </w:t>
       </w:r>
       <w:r>
         <w:rPr>
@@ -6528,33 +6474,7 @@
           <w:lang w:eastAsia="id-ID"/>
           <w14:ligatures w14:val="none"/>
         </w:rPr>
-        <w:t xml:space="preserve"> </w:t>
-      </w:r>
-      <w:proofErr w:type="spellStart"/>
-      <w:r>
-        <w:rPr>
-          <w:rFonts w:ascii="Courier New" w:eastAsia="Times New Roman" w:hAnsi="Courier New" w:cs="Courier New"/>
-          <w:color w:val="000000"/>
-          <w:kern w:val="0"/>
-          <w:sz w:val="21"/>
-          <w:szCs w:val="21"/>
-          <w:lang w:eastAsia="id-ID"/>
-          <w14:ligatures w14:val="none"/>
-        </w:rPr>
-        <w:t>col</w:t>
-      </w:r>
-      <w:proofErr w:type="spellEnd"/>
-      <w:r>
-        <w:rPr>
-          <w:rFonts w:ascii="Courier New" w:eastAsia="Times New Roman" w:hAnsi="Courier New" w:cs="Courier New"/>
-          <w:color w:val="000000"/>
-          <w:kern w:val="0"/>
-          <w:sz w:val="21"/>
-          <w:szCs w:val="21"/>
-          <w:lang w:eastAsia="id-ID"/>
-          <w14:ligatures w14:val="none"/>
-        </w:rPr>
-        <w:t xml:space="preserve"> </w:t>
+        <w:t xml:space="preserve"> col </w:t>
       </w:r>
       <w:r>
         <w:rPr>
@@ -9814,6 +9734,7 @@
           <w:lang w:eastAsia="id-ID"/>
           <w14:ligatures w14:val="none"/>
         </w:rPr>
+        <w:lastRenderedPageBreak/>
         <w:t xml:space="preserve">    </w:t>
       </w:r>
       <w:r>
@@ -9867,7 +9788,6 @@
           <w:lang w:eastAsia="id-ID"/>
           <w14:ligatures w14:val="none"/>
         </w:rPr>
-        <w:lastRenderedPageBreak/>
         <w:t xml:space="preserve">    </w:t>
       </w:r>
       <w:proofErr w:type="spellStart"/>
@@ -14074,6 +13994,7 @@
           <w:lang w:eastAsia="id-ID"/>
           <w14:ligatures w14:val="none"/>
         </w:rPr>
+        <w:lastRenderedPageBreak/>
         <w:t xml:space="preserve">        </w:t>
       </w:r>
       <w:proofErr w:type="spellStart"/>
@@ -14153,7 +14074,6 @@
           <w:lang w:eastAsia="id-ID"/>
           <w14:ligatures w14:val="none"/>
         </w:rPr>
-        <w:lastRenderedPageBreak/>
         <w:t xml:space="preserve">        </w:t>
       </w:r>
       <w:proofErr w:type="spellStart"/>
@@ -17720,6 +17640,7 @@
           <w:lang w:eastAsia="id-ID"/>
           <w14:ligatures w14:val="none"/>
         </w:rPr>
+        <w:lastRenderedPageBreak/>
         <w:t>    ax1.set_title(</w:t>
       </w:r>
       <w:r>
@@ -24634,6 +24555,7 @@
   <w:style w:type="character" w:default="1" w:styleId="DefaultParagraphFont">
     <w:name w:val="Default Paragraph Font"/>
     <w:uiPriority w:val="1"/>
+    <w:semiHidden/>
     <w:unhideWhenUsed/>
   </w:style>
   <w:style w:type="table" w:default="1" w:styleId="TableNormal">

</xml_diff>